<commit_message>
Add 4/5 Conquering Through Christ Sunday School materials and update 3/22 lesson
Co-Authored-By: Claude Opus 4.6 (1M context) <noreply@anthropic.com>
</commit_message>
<xml_diff>
--- a/ECC Sunday School - Becoming a Living Sacrifice (Middle School).docx
+++ b/ECC Sunday School - Becoming a Living Sacrifice (Middle School).docx
@@ -1125,19 +1125,7 @@
         <w:t xml:space="preserve"> </w:t>
       </w:r>
       <w:r>
-        <w:t xml:space="preserve">- Elder Elton gave a great example:</w:t>
-      </w:r>
-      <w:r>
-        <w:t xml:space="preserve"> </w:t>
-      </w:r>
-      <w:r>
-        <w:t xml:space="preserve">“If I told you this morning you couldn’t lie anymore – how many of you think that would cramp your lifestyle?”</w:t>
-      </w:r>
-      <w:r>
-        <w:t xml:space="preserve"> </w:t>
-      </w:r>
-      <w:r>
-        <w:t xml:space="preserve">He pointed out that parents sometimes lie about their kid’s age to get a cheaper ticket. What does that teach kids? That lying is OK as long as the benefit is worth it. As Christians, we let GOD define right and wrong, even when it’s inconvenient.</w:t>
+        <w:t xml:space="preserve">- As Christians, we let GOD define right and wrong, even when it’s inconvenient or goes against what everyone around us is doing.</w:t>
       </w:r>
     </w:p>
     <w:p>
@@ -1927,7 +1915,7 @@
         </w:numPr>
       </w:pPr>
       <w:r>
-        <w:t xml:space="preserve">Elder Elton gave an example of parents lying about their kid’s age to get a discount – a</w:t>
+        <w:t xml:space="preserve">The world is full of</w:t>
       </w:r>
       <w:r>
         <w:t xml:space="preserve"> </w:t>
@@ -1939,7 +1927,7 @@
         <w:t xml:space="preserve"> </w:t>
       </w:r>
       <w:r>
-        <w:t xml:space="preserve">lie that seems harmless. Think about your everyday life at school and with friends. What are some</w:t>
+        <w:t xml:space="preserve">compromises that seem harmless. Think about your everyday life at school and with friends. What are some</w:t>
       </w:r>
       <w:r>
         <w:t xml:space="preserve"> </w:t>
@@ -1963,7 +1951,19 @@
         <w:t xml:space="preserve"> </w:t>
       </w:r>
       <w:r>
-        <w:t xml:space="preserve">when you’re not, laughing at a joke that puts someone down, pretending to like something to fit in.) Why are these so easy to justify?</w:t>
+        <w:t xml:space="preserve">when you’re not, laughing at a joke that puts someone down, pretending to like something to fit in, telling a</w:t>
+      </w:r>
+      <w:r>
+        <w:t xml:space="preserve"> </w:t>
+      </w:r>
+      <w:r>
+        <w:t xml:space="preserve">“white lie”</w:t>
+      </w:r>
+      <w:r>
+        <w:t xml:space="preserve"> </w:t>
+      </w:r>
+      <w:r>
+        <w:t xml:space="preserve">to avoid trouble.) Why are these so easy to justify?</w:t>
       </w:r>
     </w:p>
     <w:p>

</xml_diff>